<commit_message>
viet tai lieu cho project
</commit_message>
<xml_diff>
--- a/apps/ceo1983_app_fe/public/docs/SRS_01_Web_CRM_CEO1983.docx
+++ b/apps/ceo1983_app_fe/public/docs/SRS_01_Web_CRM_CEO1983.docx
@@ -1407,7 +1407,7 @@
                 <w:sz w:val="19"/>
                 <w:szCs w:val="19"/>
               </w:rPr>
-              <w:t xml:space="preserve">Hồ Sơ Hội Viên 360°, Quy Trình Thẩm Định Kết Nạp &amp; Quản Trị Vòng Đời Niên Liễm</w:t>
+              <w:t xml:space="preserve">Hồ Sơ Hội Viên 360°, Quy Trình Thẩm Định Kết Nạp &amp; Quản Trị Vòng Đời Hội Phí Thường Niên</w:t>
             </w:r>
           </w:p>
         </w:tc>
@@ -5248,7 +5248,7 @@
                 <w:sz w:val="19"/>
                 <w:szCs w:val="19"/>
               </w:rPr>
-              <w:t xml:space="preserve">Gia Hạn Niên Liễm</w:t>
+              <w:t xml:space="preserve">Gia hạn hội phí</w:t>
             </w:r>
           </w:p>
         </w:tc>
@@ -12405,7 +12405,7 @@
           <w:sz w:val="26"/>
           <w:szCs w:val="26"/>
         </w:rPr>
-        <w:t xml:space="preserve">4.3 Luồng Gia Hạn Niên Liễm Hội Viên (+365 Ngày)</w:t>
+        <w:t xml:space="preserve">4.3 Luồng Gia hạn hội phí Hội Viên (+365 Ngày)</w:t>
       </w:r>
     </w:p>
     <w:p>
@@ -12480,7 +12480,7 @@
           <w:szCs w:val="24"/>
         </w:rPr>
         <w:br/>
-        <w:t xml:space="preserve">  - Bước 2: Khi hội viên đóng hội phí năm mới (được Ban Tài Chính đối soát hoặc hệ thống VietQR gạch nợ tự động), Ban Thành Viên mở hồ sơ hội viên và bấm nút "Gia hạn niên liễm".</w:t>
+        <w:t xml:space="preserve">  - Bước 2: Khi hội viên đóng hội phí năm mới (được Ban Tài Chính đối soát hoặc hệ thống VietQR gạch nợ tự động), Ban Thành Viên mở hồ sơ hội viên và bấm nút "Gia hạn hội phí".</w:t>
       </w:r>
       <w:r>
         <w:rPr>
@@ -22070,7 +22070,7 @@
                 <w:sz w:val="19"/>
                 <w:szCs w:val="19"/>
               </w:rPr>
-              <w:t xml:space="preserve">Loại phí: "ANNUAL_MEMBERSHIP" (Niên liễm), "EVENT_SPONSOR" (Tài trợ), "AD_BANNER" (Quảng cáo).</w:t>
+              <w:t xml:space="preserve">Loại phí: "ANNUAL_MEMBERSHIP" (Hội phí thường niên), "EVENT_SPONSOR" (Tài trợ), "AD_BANNER" (Quảng cáo).</w:t>
             </w:r>
           </w:p>
         </w:tc>

</xml_diff>